<commit_message>
docs: rebuild one-page wireframes from the actual client source
Co-Authored-By: Claude Sonnet 5.5 <noreply@anthropic.com>
Claude-Session: https://claude.ai/code/session_01LTCF9bNy6zYrqymk3HAyLm
</commit_message>
<xml_diff>
--- a/docs/diagrams/wireframes-one-page.docx
+++ b/docs/diagrams/wireframes-one-page.docx
@@ -6,7 +6,7 @@
       <w:r>
         <w:drawing>
           <wp:inline xmlns:a="http://schemas.openxmlformats.org/drawingml/2006/main" xmlns:pic="http://schemas.openxmlformats.org/drawingml/2006/picture">
-            <wp:extent cx="6480000" cy="8922461"/>
+            <wp:extent cx="6625895" cy="9684000"/>
             <wp:docPr id="1" name="Picture 1"/>
             <wp:cNvGraphicFramePr>
               <a:graphicFrameLocks noChangeAspect="1"/>
@@ -27,7 +27,7 @@
                   <pic:spPr>
                     <a:xfrm>
                       <a:off x="0" y="0"/>
-                      <a:ext cx="6480000" cy="8922461"/>
+                      <a:ext cx="6625895" cy="9684000"/>
                     </a:xfrm>
                     <a:prstGeom prst="rect"/>
                   </pic:spPr>
@@ -40,7 +40,7 @@
     </w:p>
     <w:sectPr>
       <w:pgSz w:w="11906" w:h="16838"/>
-      <w:pgMar w:top="850" w:right="850" w:bottom="850" w:left="850" w:header="720" w:footer="720" w:gutter="0"/>
+      <w:pgMar w:top="680" w:right="680" w:bottom="680" w:left="680" w:header="720" w:footer="720" w:gutter="0"/>
       <w:cols w:space="720"/>
       <w:docGrid w:linePitch="360"/>
     </w:sectPr>

</xml_diff>